<commit_message>
Tejal Course Portal Git
</commit_message>
<xml_diff>
--- a/CoursePortal Gitlinks/Git links.docx
+++ b/CoursePortal Gitlinks/Git links.docx
@@ -4,15 +4,7 @@
   <w:body>
     <w:p>
       <w:r>
-        <w:t xml:space="preserve">Git </w:t>
-      </w:r>
-      <w:proofErr w:type="gramStart"/>
-      <w:r>
-        <w:t>Repos :</w:t>
-      </w:r>
-      <w:proofErr w:type="gramEnd"/>
-      <w:r>
-        <w:t xml:space="preserve">  Angular Module Project</w:t>
+        <w:t>Git Repos :  Angular Module Project</w:t>
       </w:r>
     </w:p>
     <w:p/>
@@ -22,13 +14,8 @@
       </w:r>
     </w:p>
     <w:p>
-      <w:proofErr w:type="gramStart"/>
-      <w:r>
-        <w:t>Sumit :</w:t>
-      </w:r>
-      <w:proofErr w:type="gramEnd"/>
-      <w:r>
-        <w:t xml:space="preserve"> </w:t>
+      <w:r>
+        <w:t xml:space="preserve">Sumit : </w:t>
       </w:r>
       <w:hyperlink r:id="rId4" w:history="1">
         <w:r>
@@ -40,18 +27,8 @@
       </w:hyperlink>
     </w:p>
     <w:p>
-      <w:proofErr w:type="spellStart"/>
-      <w:proofErr w:type="gramStart"/>
-      <w:r>
-        <w:t>Shibhom</w:t>
-      </w:r>
-      <w:proofErr w:type="spellEnd"/>
-      <w:r>
-        <w:t xml:space="preserve"> :</w:t>
-      </w:r>
-      <w:proofErr w:type="gramEnd"/>
-      <w:r>
-        <w:t xml:space="preserve"> </w:t>
+      <w:r>
+        <w:t xml:space="preserve">Shibhom : </w:t>
       </w:r>
       <w:hyperlink r:id="rId5" w:history="1">
         <w:r>
@@ -63,13 +40,8 @@
       </w:hyperlink>
     </w:p>
     <w:p>
-      <w:proofErr w:type="gramStart"/>
-      <w:r>
-        <w:t>Saurabh :</w:t>
-      </w:r>
-      <w:proofErr w:type="gramEnd"/>
-      <w:r>
-        <w:t xml:space="preserve">  </w:t>
+      <w:r>
+        <w:t xml:space="preserve">Saurabh :  </w:t>
       </w:r>
       <w:hyperlink r:id="rId6" w:history="1">
         <w:r>
@@ -89,21 +61,7 @@
           <w:rPr>
             <w:rStyle w:val="Hyperlink"/>
           </w:rPr>
-          <w:t>Pranay-m12/</w:t>
-        </w:r>
-        <w:proofErr w:type="spellStart"/>
-        <w:r>
-          <w:rPr>
-            <w:rStyle w:val="Hyperlink"/>
-          </w:rPr>
-          <w:t>Angular_KDI_Assignment</w:t>
-        </w:r>
-        <w:proofErr w:type="spellEnd"/>
-        <w:r>
-          <w:rPr>
-            <w:rStyle w:val="Hyperlink"/>
-          </w:rPr>
-          <w:t xml:space="preserve"> at master (github.com)</w:t>
+          <w:t>Pranay-m12/Angular_KDI_Assignment at master (github.com)</w:t>
         </w:r>
       </w:hyperlink>
     </w:p>
@@ -121,13 +79,8 @@
       </w:hyperlink>
     </w:p>
     <w:p>
-      <w:proofErr w:type="gramStart"/>
-      <w:r>
-        <w:t>Manish :</w:t>
-      </w:r>
-      <w:proofErr w:type="gramEnd"/>
-      <w:r>
-        <w:t xml:space="preserve">  </w:t>
+      <w:r>
+        <w:t xml:space="preserve">Manish :  </w:t>
       </w:r>
       <w:hyperlink r:id="rId9" w:history="1">
         <w:r>
@@ -184,132 +137,103 @@
           <w:u w:val="single"/>
         </w:rPr>
       </w:pPr>
-      <w:proofErr w:type="gramStart"/>
-      <w:r>
-        <w:t>Fakir :</w:t>
-      </w:r>
-      <w:proofErr w:type="gramEnd"/>
+      <w:r>
+        <w:t xml:space="preserve">Fakir : </w:t>
+      </w:r>
+      <w:hyperlink r:id="rId11" w:history="1">
+        <w:r>
+          <w:rPr>
+            <w:rStyle w:val="Hyperlink"/>
+          </w:rPr>
+          <w:t>https://github.com/fmp-kongs/kLearning</w:t>
+        </w:r>
+      </w:hyperlink>
+    </w:p>
+    <w:p>
+      <w:r>
+        <w:t>Jinil</w:t>
+      </w:r>
+      <w:r>
+        <w:t xml:space="preserve"> : </w:t>
+      </w:r>
+      <w:hyperlink r:id="rId12" w:history="1">
+        <w:r>
+          <w:rPr>
+            <w:rStyle w:val="Hyperlink"/>
+          </w:rPr>
+          <w:t>https://github.com/jjthakkar30/uDemo</w:t>
+        </w:r>
+      </w:hyperlink>
+    </w:p>
+    <w:p>
+      <w:r>
+        <w:t xml:space="preserve">Devwrat :  </w:t>
+      </w:r>
+      <w:hyperlink r:id="rId13" w:tgtFrame="_blank" w:tooltip="https://github.com/pkbneil/epaathshala" w:history="1">
+        <w:r>
+          <w:rPr>
+            <w:rStyle w:val="Hyperlink"/>
+          </w:rPr>
+          <w:t>https://github.com/pkbneil/epaathshala</w:t>
+        </w:r>
+      </w:hyperlink>
+    </w:p>
+    <w:p>
+      <w:r>
+        <w:t xml:space="preserve">Hadi : </w:t>
+      </w:r>
+      <w:hyperlink r:id="rId14" w:history="1">
+        <w:r>
+          <w:rPr>
+            <w:rStyle w:val="Hyperlink"/>
+          </w:rPr>
+          <w:t>https://github.com/hadi-pv/coursePortal.git</w:t>
+        </w:r>
+      </w:hyperlink>
+    </w:p>
+    <w:p>
+      <w:r>
+        <w:t xml:space="preserve">Sairama : </w:t>
+      </w:r>
       <w:r>
         <w:t xml:space="preserve"> </w:t>
       </w:r>
-      <w:hyperlink r:id="rId11" w:history="1">
-        <w:r>
-          <w:rPr>
-            <w:rStyle w:val="Hyperlink"/>
-          </w:rPr>
-          <w:t>https://github.com/fmp-kongs/kLearning</w:t>
-        </w:r>
-      </w:hyperlink>
-    </w:p>
-    <w:p>
-      <w:proofErr w:type="spellStart"/>
-      <w:proofErr w:type="gramStart"/>
-      <w:r>
-        <w:t>Jinil</w:t>
-      </w:r>
-      <w:proofErr w:type="spellEnd"/>
+      <w:hyperlink r:id="rId15" w:tgtFrame="_blank" w:tooltip="https://github.com/sairama-s/courseswebsite.git" w:history="1">
+        <w:r>
+          <w:rPr>
+            <w:rStyle w:val="Hyperlink"/>
+          </w:rPr>
+          <w:t>https://github.com/Sairama-S/CoursesWebsite.git</w:t>
+        </w:r>
+      </w:hyperlink>
+    </w:p>
+    <w:p>
+      <w:r>
+        <w:t>Tejal :</w:t>
+      </w:r>
       <w:r>
         <w:t xml:space="preserve"> </w:t>
       </w:r>
+      <w:hyperlink r:id="rId16" w:tgtFrame="_blank" w:tooltip="https://github.com/tejalmeshram27/course-project-1" w:history="1">
+        <w:r>
+          <w:rPr>
+            <w:rStyle w:val="Hyperlink"/>
+          </w:rPr>
+          <w:t>https://github.com/tejalmeshram27/Course-Project-1</w:t>
+        </w:r>
+      </w:hyperlink>
+    </w:p>
+    <w:p>
+      <w:r>
+        <w:t>Dhruv</w:t>
+      </w:r>
       <w:r>
         <w:t>:</w:t>
       </w:r>
-      <w:proofErr w:type="gramEnd"/>
       <w:r>
         <w:t xml:space="preserve"> </w:t>
       </w:r>
-      <w:hyperlink r:id="rId12" w:history="1">
-        <w:r>
-          <w:rPr>
-            <w:rStyle w:val="Hyperlink"/>
-          </w:rPr>
-          <w:t>https://github.com/jjthakkar30/uDemo</w:t>
-        </w:r>
-      </w:hyperlink>
-    </w:p>
-    <w:p>
-      <w:proofErr w:type="spellStart"/>
-      <w:proofErr w:type="gramStart"/>
-      <w:r>
-        <w:t>Devwrat</w:t>
-      </w:r>
-      <w:proofErr w:type="spellEnd"/>
-      <w:r>
-        <w:t xml:space="preserve"> :</w:t>
-      </w:r>
-      <w:proofErr w:type="gramEnd"/>
-      <w:r>
-        <w:t xml:space="preserve">  </w:t>
-      </w:r>
-      <w:hyperlink r:id="rId13" w:tgtFrame="_blank" w:tooltip="https://github.com/pkbneil/epaathshala" w:history="1">
-        <w:r>
-          <w:rPr>
-            <w:rStyle w:val="Hyperlink"/>
-          </w:rPr>
-          <w:t>https://github.com/pkbneil/epaathshala</w:t>
-        </w:r>
-      </w:hyperlink>
-    </w:p>
-    <w:p>
-      <w:proofErr w:type="gramStart"/>
-      <w:r>
-        <w:t>Hadi :</w:t>
-      </w:r>
-      <w:proofErr w:type="gramEnd"/>
-      <w:r>
-        <w:t xml:space="preserve"> </w:t>
-      </w:r>
-      <w:hyperlink r:id="rId14" w:history="1">
-        <w:r>
-          <w:rPr>
-            <w:rStyle w:val="Hyperlink"/>
-          </w:rPr>
-          <w:t>https://github.com/hadi-pv/coursePortal.git</w:t>
-        </w:r>
-      </w:hyperlink>
-    </w:p>
-    <w:p>
-      <w:proofErr w:type="spellStart"/>
-      <w:r>
-        <w:t>Sairama</w:t>
-      </w:r>
-      <w:proofErr w:type="spellEnd"/>
-      <w:r>
-        <w:t xml:space="preserve"> : </w:t>
-      </w:r>
-      <w:r>
-        <w:t xml:space="preserve"> </w:t>
-      </w:r>
-      <w:hyperlink r:id="rId15" w:tgtFrame="_blank" w:tooltip="https://github.com/sairama-s/courseswebsite.git" w:history="1">
-        <w:r>
-          <w:rPr>
-            <w:rStyle w:val="Hyperlink"/>
-          </w:rPr>
-          <w:t>https://github.com/Sairama-S/CoursesWebsite.git</w:t>
-        </w:r>
-      </w:hyperlink>
-    </w:p>
-    <w:p>
-      <w:proofErr w:type="gramStart"/>
-      <w:r>
-        <w:t>Tejal :</w:t>
-      </w:r>
-      <w:proofErr w:type="gramEnd"/>
-      <w:r>
-        <w:t xml:space="preserve"> </w:t>
-      </w:r>
-    </w:p>
-    <w:p>
-      <w:r>
-        <w:t>Dhruv</w:t>
-      </w:r>
-      <w:r>
-        <w:t>:</w:t>
-      </w:r>
-      <w:r>
-        <w:t xml:space="preserve"> </w:t>
-      </w:r>
-      <w:hyperlink r:id="rId16" w:tgtFrame="_blank" w:tooltip="https://github.com/dhruvoza/course_project/tree/master" w:history="1">
+      <w:hyperlink r:id="rId17" w:tgtFrame="_blank" w:tooltip="https://github.com/dhruvoza/course_project/tree/master" w:history="1">
         <w:r>
           <w:rPr>
             <w:rStyle w:val="Hyperlink"/>

</xml_diff>